<commit_message>
Add new page configuration for Mahkamah Agung Republik Indonesia with various sections including navigation, news articles, and contact information.
</commit_message>
<xml_diff>
--- a/doc/Laporan_Pertemuan11_Information_Search.docx
+++ b/doc/Laporan_Pertemuan11_Information_Search.docx
@@ -467,132 +467,182 @@
     </w:p>
     <w:p>
       <w:r>
-        <w:rPr>
-          <w:b w:val="0"/>
-          <w:i w:val="0"/>
-        </w:rPr>
-        <w:t>Analisis berikut mengamati proses pengguna ketika mencari informasi pada website Mahkamah Agung versi lama, berdasarkan observasi dan evaluasi heuristik yang telah dilakukan tim.</w:t>
+        <w:t>Proses pengguna saat mencari informasi pada website Mahkamah Agung versi lama diamati melalui observasi dan evaluasi heuristik yang dilakukan tim.</w:t>
+      </w:r>
+    </w:p>
+    <w:p>
+      <w:pPr>
+        <w:pStyle w:val="Heading2"/>
+      </w:pPr>
+      <w:r>
+        <w:t>2.1 Memulai pencarian</w:t>
       </w:r>
     </w:p>
     <w:p>
       <w:r>
-        <w:rPr>
-          <w:b/>
-        </w:rPr>
-        <w:t xml:space="preserve">Bagaimana pengguna memulai pencarian? </w:t>
+        <w:t>Pengguna memulai pencarian dengan mengetik kata kunci di satu kotak input teks polos berlabel "Kata Kunci". Kotak ini berada di pojok kanan atas navbar, terpisah dari konten utama, sehingga pengguna harus mengalihkan perhatian dari isi halaman untuk mencarinya.</w:t>
       </w:r>
+    </w:p>
+    <w:p>
+      <w:pPr>
+        <w:pStyle w:val="Heading2"/>
+      </w:pPr>
       <w:r>
-        <w:t>Pengguna mengetik kata kunci pada satu kotak input teks polos ("Kata Kunci") yang terletak di pojok kanan atas navbar, terpisah dari konten utama halaman.</w:t>
+        <w:t>2.2 Kemudahan menemukan fitur search</w:t>
       </w:r>
     </w:p>
     <w:p>
       <w:r>
-        <w:rPr>
-          <w:b/>
-        </w:rPr>
-        <w:t xml:space="preserve">Apakah fitur search mudah ditemukan? </w:t>
+        <w:t>Fitur search cukup mudah ditemukan karena posisinya konsisten di navbar. Namun tidak ada petunjuk visual tentang cakupan pencariannya. Pengguna tidak bisa tahu apakah kotak ini mencari lintas kategori (perkara, berita, dan kebijakan sekaligus) atau hanya salah satunya, sehingga mereka harus menebak-nebak.</w:t>
       </w:r>
+    </w:p>
+    <w:p>
+      <w:pPr>
+        <w:pStyle w:val="Heading2"/>
+      </w:pPr>
       <w:r>
-        <w:t>Cukup mudah ditemukan karena posisinya konsisten di navbar, namun tidak ada indikasi visual bahwa kotak tersebut dapat mencari lintas kategori (perkara, berita, kebijakan sekaligus) atau hanya salah satunya.</w:t>
+        <w:t>2.3 Memasukkan kata kunci</w:t>
       </w:r>
     </w:p>
     <w:p>
       <w:r>
-        <w:rPr>
-          <w:b/>
-        </w:rPr>
-        <w:t xml:space="preserve">Bagaimana pengguna memasukkan kata kunci? </w:t>
+        <w:t>Kata kunci dimasukkan lewat satu input teks saja, tanpa label kategori, validasi format, maupun contoh penulisan. Untuk pencarian yang butuh format khusus seperti nomor perkara, pengguna awam tidak punya panduan untuk menulisnya dengan benar.</w:t>
       </w:r>
+    </w:p>
+    <w:p>
+      <w:pPr>
+        <w:pStyle w:val="Heading2"/>
+      </w:pPr>
       <w:r>
-        <w:t>Melalui satu input teks tanpa label kategori, tanpa validasi format, dan tanpa contoh format pencarian (misalnya format nomor perkara).</w:t>
+        <w:t>2.4 Autocomplete dan search suggestion</w:t>
       </w:r>
     </w:p>
     <w:p>
       <w:r>
-        <w:rPr>
-          <w:b/>
-        </w:rPr>
-        <w:t xml:space="preserve">Apakah terdapat autocomplete atau search suggestion? </w:t>
+        <w:t>Fitur ini tidak tersedia. Saat pengguna mengetik, tidak muncul saran kata kunci maupun pratinjau hasil, sehingga pengguna baru tahu hasilnya setelah menyelesaikan input dan menjalankan pencarian.</w:t>
       </w:r>
+    </w:p>
+    <w:p>
+      <w:pPr>
+        <w:pStyle w:val="Heading2"/>
+      </w:pPr>
       <w:r>
-        <w:t>Tidak ada. Tidak muncul saran kata kunci maupun pratinjau hasil saat pengguna mengetik.</w:t>
+        <w:t>2.5 Tampilan hasil pencarian</w:t>
       </w:r>
     </w:p>
     <w:p>
       <w:r>
-        <w:rPr>
-          <w:b/>
-        </w:rPr>
-        <w:t xml:space="preserve">Bagaimana hasil pencarian ditampilkan? </w:t>
+        <w:t>Hasil pencarian perkara ditampilkan di sub-sistem "Info Perkara MA-RI", yang gaya visualnya sama sekali berbeda dari situs utama. Perpindahan ini membuat pengguna kehilangan konteks navigasi dan bisa merasa berpindah ke situs lain.</w:t>
       </w:r>
+    </w:p>
+    <w:p>
+      <w:pPr>
+        <w:pStyle w:val="Heading2"/>
+      </w:pPr>
       <w:r>
-        <w:t>Berdasarkan temuan evaluasi heuristik, hasil pencarian perkara pada sub-sistem "Info Perkara MA-RI" ditampilkan pada halaman dengan gaya visual yang sama sekali berbeda dari situs utama, sehingga pengguna kehilangan konteks navigasi situs utama.</w:t>
+        <w:t>2.6 Kemudahan menemukan hasil yang paling relevan</w:t>
       </w:r>
     </w:p>
     <w:p>
       <w:r>
-        <w:rPr>
-          <w:b/>
-        </w:rPr>
-        <w:t xml:space="preserve">Apakah hasil yang paling relevan mudah ditemukan? </w:t>
+        <w:t>Hasil yang paling relevan sulit dipastikan karena tidak ada indikator relevansi, highlight kata kunci, maupun ringkasan singkat pada tiap hasil, sehingga pengguna harus membuka dan memeriksa hasil satu per satu.</w:t>
       </w:r>
+    </w:p>
+    <w:p>
+      <w:pPr>
+        <w:pStyle w:val="Heading2"/>
+      </w:pPr>
       <w:r>
-        <w:t>Sulit dipastikan karena tidak ada indikator relevansi, highlight kata kunci, maupun ringkasan singkat pada tiap hasil.</w:t>
+        <w:t>2.7 Ketersediaan filter</w:t>
       </w:r>
     </w:p>
     <w:p>
       <w:r>
-        <w:rPr>
-          <w:b/>
-        </w:rPr>
-        <w:t xml:space="preserve">Apakah tersedia filter? </w:t>
+        <w:t>Kotak pencarian di navbar tidak menyediakan filter berdasarkan jenis perkara, tanggal, maupun lokasi pengadilan, sehingga pengguna tidak bisa mempersempit hasil.</w:t>
       </w:r>
+    </w:p>
+    <w:p>
+      <w:pPr>
+        <w:pStyle w:val="Heading2"/>
+      </w:pPr>
       <w:r>
-        <w:t>Tidak tersedia filter jenis perkara, tanggal, maupun lokasi pengadilan pada kotak pencarian navbar.</w:t>
+        <w:t>2.8 Ketersediaan sorting</w:t>
       </w:r>
     </w:p>
     <w:p>
       <w:r>
-        <w:rPr>
-          <w:b/>
-        </w:rPr>
-        <w:t xml:space="preserve">Apakah tersedia sorting? </w:t>
+        <w:t>Tidak ditemukan kontrol pengurutan hasil, baik berdasarkan tanggal terbaru maupun relevansi. Pengguna harus menerima urutan hasil apa adanya.</w:t>
       </w:r>
+    </w:p>
+    <w:p>
+      <w:pPr>
+        <w:pStyle w:val="Heading2"/>
+      </w:pPr>
       <w:r>
-        <w:t>Tidak ditemukan kontrol pengurutan hasil (misalnya berdasarkan tanggal terbaru atau relevansi).</w:t>
+        <w:t>2.9 Feedback dari sistem</w:t>
       </w:r>
     </w:p>
     <w:p>
       <w:r>
-        <w:rPr>
-          <w:b/>
-        </w:rPr>
-        <w:t xml:space="preserve">Apakah pengguna mendapatkan feedback dari sistem? </w:t>
+        <w:t>Evaluasi heuristik menemukan bahwa feedback saat terjadi masalah pencarian sangat terbatas dan memakai bahasa teknis yang sulit dipahami pengguna awam. Hal ini melanggar prinsip Help Users Recognize, Diagnose, and Recover from Errors (Nielsen, 1994), karena pengguna tidak tahu apa yang salah maupun cara memperbaikinya.</w:t>
       </w:r>
+    </w:p>
+    <w:p>
+      <w:pPr>
+        <w:pStyle w:val="Heading2"/>
+      </w:pPr>
       <w:r>
-        <w:t>Feedback yang diberikan sangat terbatas. Evaluasi heuristik menemukan bahwa pesan yang muncul saat terjadi masalah pencarian menggunakan bahasa teknis yang sulit dipahami pengguna awam (melanggar prinsip Help Users Recognize, Diagnose, and Recover from Errors, Nielsen 1994).</w:t>
+        <w:t>2.10 Kondisi ketika pencarian tidak menghasilkan informasi</w:t>
       </w:r>
     </w:p>
     <w:p>
       <w:r>
-        <w:rPr>
-          <w:b/>
-        </w:rPr>
-        <w:t xml:space="preserve">Apa yang terjadi jika pencarian tidak menghasilkan informasi? </w:t>
+        <w:t>Tidak ada halaman atau pesan "tidak ditemukan" yang dirancang khusus, sehingga no-result state tidak informatif dan pengguna tidak terbantu melanjutkan pencarian, misalnya lewat saran kata kunci lain atau tautan bantuan.</w:t>
       </w:r>
+    </w:p>
+    <w:p>
+      <w:pPr>
+        <w:pStyle w:val="Heading2"/>
+      </w:pPr>
       <w:r>
-        <w:t>Tidak ada halaman atau pesan "tidak ditemukan" yang dirancang khusus dan membantu pengguna melanjutkan pencarian (no-result state tidak informatif).</w:t>
+        <w:t>2.11 Jumlah langkah untuk menemukan informasi</w:t>
       </w:r>
     </w:p>
     <w:p>
       <w:r>
-        <w:rPr>
-          <w:b/>
-        </w:rPr>
-        <w:t xml:space="preserve">Berapa langkah yang diperlukan pengguna sampai menemukan informasi yang dicari? </w:t>
+        <w:t>Pengguna membutuhkan minimal 4 langkah, dan hasilnya pun belum tentu pasti:</w:t>
       </w:r>
+    </w:p>
+    <w:p>
+      <w:pPr>
+        <w:pStyle w:val="ListNumber"/>
+      </w:pPr>
       <w:r>
-        <w:t>Minimal 4 langkah dengan hasil yang tidak pasti: (1) menemukan kotak pencarian di navbar, (2) mengetik kata kunci tanpa panduan format, (3) berpindah ke sub-sistem "Info Perkara MA-RI" yang tampilannya berbeda total, dan (4) menelusuri hasil tanpa filter atau indikator relevansi untuk menemukan data yang tepat.</w:t>
+        <w:t>Menemukan kotak pencarian di navbar.</w:t>
+      </w:r>
+    </w:p>
+    <w:p>
+      <w:pPr>
+        <w:pStyle w:val="ListNumber"/>
+      </w:pPr>
+      <w:r>
+        <w:t>Mengetik kata kunci tanpa panduan format.</w:t>
+      </w:r>
+    </w:p>
+    <w:p>
+      <w:pPr>
+        <w:pStyle w:val="ListNumber"/>
+      </w:pPr>
+      <w:r>
+        <w:t>Berpindah ke sub-sistem "Info Perkara MA-RI" yang tampilannya berbeda total.</w:t>
+      </w:r>
+    </w:p>
+    <w:p>
+      <w:pPr>
+        <w:pStyle w:val="ListNumber"/>
+      </w:pPr>
+      <w:r>
+        <w:t>Menelusuri hasil tanpa filter atau indikator relevansi untuk menemukan data yang tepat.</w:t>
       </w:r>
     </w:p>
     <w:p>

</xml_diff>